<commit_message>
Add execution evidence to practical reports
</commit_message>
<xml_diff>
--- a/Отчет_ПР1_Есина_В.Д.docx
+++ b/Отчет_ПР1_Есина_В.Д.docx
@@ -1744,6 +1744,132 @@
           <w:sz w:val="24"/>
         </w:rPr>
         <w:t>В ходе работы закреплены базовые конструкции Python и начата разработка сквозного проекта. Полученная программа решает законченный учебный сценарий и создаёт основу для последующего перехода к модульной структуре, хранению данных и объектно-ориентированному программированию.</w:t>
+      </w:r>
+    </w:p>
+    <w:p>
+      <w:r>
+        <w:br w:type="page"/>
+      </w:r>
+    </w:p>
+    <w:p>
+      <w:pPr>
+        <w:jc w:val="center"/>
+      </w:pPr>
+      <w:r>
+        <w:rPr>
+          <w:rFonts w:ascii="Times New Roman" w:hAnsi="Times New Roman" w:eastAsia="Times New Roman"/>
+          <w:b/>
+          <w:sz w:val="26"/>
+        </w:rPr>
+        <w:t>ПРИЛОЖЕНИЕ. ПОДТВЕРЖДЕНИЕ ВЫПОЛНЕНИЯ</w:t>
+      </w:r>
+    </w:p>
+    <w:p>
+      <w:pPr>
+        <w:keepNext/>
+        <w:spacing w:before="160"/>
+        <w:jc w:val="center"/>
+      </w:pPr>
+      <w:r>
+        <w:rPr>
+          <w:rFonts w:ascii="Times New Roman" w:hAnsi="Times New Roman" w:eastAsia="Times New Roman"/>
+          <w:b w:val="0"/>
+          <w:sz w:val="22"/>
+        </w:rPr>
+        <w:t>Рисунок 1 — запуск программы ПР1</w:t>
+      </w:r>
+    </w:p>
+    <w:p>
+      <w:pPr>
+        <w:jc w:val="center"/>
+      </w:pPr>
+      <w:r>
+        <w:drawing>
+          <wp:inline xmlns:a="http://schemas.openxmlformats.org/drawingml/2006/main" xmlns:pic="http://schemas.openxmlformats.org/drawingml/2006/picture">
+            <wp:extent cx="5580000" cy="1365240"/>
+            <wp:docPr id="1468553569" name="Picture 1468553569"/>
+            <wp:cNvGraphicFramePr>
+              <a:graphicFrameLocks noChangeAspect="1"/>
+            </wp:cNvGraphicFramePr>
+            <a:graphic>
+              <a:graphicData uri="http://schemas.openxmlformats.org/drawingml/2006/picture">
+                <pic:pic>
+                  <pic:nvPicPr>
+                    <pic:cNvPr id="0" name="pr1_run.png"/>
+                    <pic:cNvPicPr/>
+                  </pic:nvPicPr>
+                  <pic:blipFill>
+                    <a:blip r:embed="rId9"/>
+                    <a:stretch>
+                      <a:fillRect/>
+                    </a:stretch>
+                  </pic:blipFill>
+                  <pic:spPr>
+                    <a:xfrm>
+                      <a:off x="0" y="0"/>
+                      <a:ext cx="5580000" cy="1365240"/>
+                    </a:xfrm>
+                    <a:prstGeom prst="rect"/>
+                  </pic:spPr>
+                </pic:pic>
+              </a:graphicData>
+            </a:graphic>
+          </wp:inline>
+        </w:drawing>
+      </w:r>
+    </w:p>
+    <w:p>
+      <w:pPr>
+        <w:keepNext/>
+        <w:spacing w:before="160"/>
+        <w:jc w:val="center"/>
+      </w:pPr>
+      <w:r>
+        <w:rPr>
+          <w:rFonts w:ascii="Times New Roman" w:hAnsi="Times New Roman" w:eastAsia="Times New Roman"/>
+          <w:b w:val="0"/>
+          <w:sz w:val="22"/>
+        </w:rPr>
+        <w:t>Рисунок 2 — история изменений Git</w:t>
+      </w:r>
+    </w:p>
+    <w:p>
+      <w:pPr>
+        <w:jc w:val="center"/>
+      </w:pPr>
+      <w:r>
+        <w:drawing>
+          <wp:inline xmlns:a="http://schemas.openxmlformats.org/drawingml/2006/main" xmlns:pic="http://schemas.openxmlformats.org/drawingml/2006/picture">
+            <wp:extent cx="5580000" cy="903960"/>
+            <wp:docPr id="1468553570" name="Picture 1468553570"/>
+            <wp:cNvGraphicFramePr>
+              <a:graphicFrameLocks noChangeAspect="1"/>
+            </wp:cNvGraphicFramePr>
+            <a:graphic>
+              <a:graphicData uri="http://schemas.openxmlformats.org/drawingml/2006/picture">
+                <pic:pic>
+                  <pic:nvPicPr>
+                    <pic:cNvPr id="0" name="git_history.png"/>
+                    <pic:cNvPicPr/>
+                  </pic:nvPicPr>
+                  <pic:blipFill>
+                    <a:blip r:embed="rId10"/>
+                    <a:stretch>
+                      <a:fillRect/>
+                    </a:stretch>
+                  </pic:blipFill>
+                  <pic:spPr>
+                    <a:xfrm>
+                      <a:off x="0" y="0"/>
+                      <a:ext cx="5580000" cy="903960"/>
+                    </a:xfrm>
+                    <a:prstGeom prst="rect"/>
+                  </pic:spPr>
+                </pic:pic>
+              </a:graphicData>
+            </a:graphic>
+          </wp:inline>
+        </w:drawing>
       </w:r>
     </w:p>
     <w:sectPr>

</xml_diff>

<commit_message>
Use student screenshots in practical work 1 report
</commit_message>
<xml_diff>
--- a/Отчет_ПР1_Есина_В.Д.docx
+++ b/Отчет_ПР1_Есина_В.Д.docx
@@ -1526,7 +1526,6 @@
       <w:pPr>
         <w:keepNext/>
         <w:spacing w:before="100" w:after="40"/>
-        <w:jc w:val="left"/>
       </w:pPr>
       <w:r>
         <w:rPr>
@@ -1551,7 +1550,22 @@
           <w:i w:val="0"/>
           <w:sz w:val="24"/>
         </w:rPr>
-        <w:t>Дисциплина: Технологии разработки приложений на базе фреймворков.</w:t>
+        <w:t>Дисциплина: Технологии разработки приложений на базе фреймворков. Студент: Есина Варвара Дмитриевна, группа ЭФБО-07-24. Тема работы: Основы Python: актуализация знаний и настройка рабочего окружения.</w:t>
+      </w:r>
+    </w:p>
+    <w:p>
+      <w:pPr>
+        <w:keepNext/>
+        <w:spacing w:before="100" w:after="40"/>
+      </w:pPr>
+      <w:r>
+        <w:rPr>
+          <w:rFonts w:ascii="Times New Roman" w:hAnsi="Times New Roman" w:eastAsia="Times New Roman"/>
+          <w:b/>
+          <w:i w:val="0"/>
+          <w:sz w:val="24"/>
+        </w:rPr>
+        <w:t>2 Индивидуальный проект</w:t>
       </w:r>
     </w:p>
     <w:p>
@@ -1567,7 +1581,22 @@
           <w:i w:val="0"/>
           <w:sz w:val="24"/>
         </w:rPr>
-        <w:t>Студент: Есина Варвара Дмитриевна, группа ЭФБО-07-24.</w:t>
+        <w:t>Проект «Система учёта коллекции скинов Counter-Strike» предназначен для ведения личной коллекции виртуальных игровых предметов. Предметная область включает пользователей, скины, коллекции и операции с предметами. Репозиторий: https://github.com/ba0baber/trsp1.</w:t>
+      </w:r>
+    </w:p>
+    <w:p>
+      <w:pPr>
+        <w:keepNext/>
+        <w:spacing w:before="100" w:after="40"/>
+      </w:pPr>
+      <w:r>
+        <w:rPr>
+          <w:rFonts w:ascii="Times New Roman" w:hAnsi="Times New Roman" w:eastAsia="Times New Roman"/>
+          <w:b/>
+          <w:i w:val="0"/>
+          <w:sz w:val="24"/>
+        </w:rPr>
+        <w:t>3 Реализованный функционал</w:t>
       </w:r>
     </w:p>
     <w:p>
@@ -1583,14 +1612,29 @@
           <w:i w:val="0"/>
           <w:sz w:val="24"/>
         </w:rPr>
-        <w:t>Тема работы: Основы Python: актуализация знаний и настройка рабочего окружения.</w:t>
+        <w:t>Создан консольный сценарий проверки покупки одного скина. Программа получает значение износа, определяет состояние экземпляра, проверяет допустимый диапазон, сравнивает цену с балансом и выводит решение.</w:t>
+      </w:r>
+    </w:p>
+    <w:p>
+      <w:pPr>
+        <w:spacing w:line="276" w:lineRule="auto" w:after="40"/>
+        <w:ind w:firstLine="709"/>
+        <w:jc w:val="both"/>
+      </w:pPr>
+      <w:r>
+        <w:rPr>
+          <w:rFonts w:ascii="Times New Roman" w:hAnsi="Times New Roman" w:eastAsia="Times New Roman"/>
+          <w:b w:val="0"/>
+          <w:i w:val="0"/>
+          <w:sz w:val="24"/>
+        </w:rPr>
+        <w:t>Применены типы int, float, str, bool и Decimal, преобразование ввода, арифметические операции, условия и импорт. Логика разделена на функции get_skin_condition, is_wear_allowed, calculate_balance_after_purchase и get_purchase_status.</w:t>
       </w:r>
     </w:p>
     <w:p>
       <w:pPr>
         <w:keepNext/>
         <w:spacing w:before="100" w:after="40"/>
-        <w:jc w:val="left"/>
       </w:pPr>
       <w:r>
         <w:rPr>
@@ -1599,7 +1643,7 @@
           <w:i w:val="0"/>
           <w:sz w:val="24"/>
         </w:rPr>
-        <w:t>2 Индивидуальный проект</w:t>
+        <w:t>4 Результат работы</w:t>
       </w:r>
     </w:p>
     <w:p>
@@ -1615,7 +1659,22 @@
           <w:i w:val="0"/>
           <w:sz w:val="24"/>
         </w:rPr>
-        <w:t>Название проекта: «Система учёта коллекции скинов Counter-Strike». Проект предназначен для ведения личной коллекции виртуальных игровых предметов. Предметная область включает пользователей, скины, коллекции и операции с предметами.</w:t>
+        <w:t>Создан Git-репозиторий с веткой main, подготовлены README.md и .gitignore, реализован начальный сценарий. Выполнены проверки состояния скина, допустимого износа, баланса и доступности предмета.</w:t>
+      </w:r>
+    </w:p>
+    <w:p>
+      <w:pPr>
+        <w:keepNext/>
+        <w:spacing w:before="100" w:after="40"/>
+      </w:pPr>
+      <w:r>
+        <w:rPr>
+          <w:rFonts w:ascii="Times New Roman" w:hAnsi="Times New Roman" w:eastAsia="Times New Roman"/>
+          <w:b/>
+          <w:i w:val="0"/>
+          <w:sz w:val="24"/>
+        </w:rPr>
+        <w:t>5 Вывод</w:t>
       </w:r>
     </w:p>
     <w:p>
@@ -1631,119 +1690,7 @@
           <w:i w:val="0"/>
           <w:sz w:val="24"/>
         </w:rPr>
-        <w:t>Репозиторий проекта: https://github.com/ba0baber/trsp1.</w:t>
-      </w:r>
-    </w:p>
-    <w:p>
-      <w:pPr>
-        <w:keepNext/>
-        <w:spacing w:before="100" w:after="40"/>
-        <w:jc w:val="left"/>
-      </w:pPr>
-      <w:r>
-        <w:rPr>
-          <w:rFonts w:ascii="Times New Roman" w:hAnsi="Times New Roman" w:eastAsia="Times New Roman"/>
-          <w:b/>
-          <w:i w:val="0"/>
-          <w:sz w:val="24"/>
-        </w:rPr>
-        <w:t>3 Реализованный функционал</w:t>
-      </w:r>
-    </w:p>
-    <w:p>
-      <w:pPr>
-        <w:spacing w:line="276" w:lineRule="auto" w:after="40"/>
-        <w:ind w:firstLine="709"/>
-        <w:jc w:val="both"/>
-      </w:pPr>
-      <w:r>
-        <w:rPr>
-          <w:rFonts w:ascii="Times New Roman" w:hAnsi="Times New Roman" w:eastAsia="Times New Roman"/>
-          <w:b w:val="0"/>
-          <w:i w:val="0"/>
-          <w:sz w:val="24"/>
-        </w:rPr>
-        <w:t>В ПР1 создан консольный сценарий проверки покупки одного скина. Пользователь вводит значение износа. Программа определяет состояние предмета, проверяет допустимость износа, рассчитывает остаток средств и сообщает, можно ли добавить скин в коллекцию.</w:t>
-      </w:r>
-    </w:p>
-    <w:p>
-      <w:pPr>
-        <w:spacing w:line="276" w:lineRule="auto" w:after="40"/>
-        <w:ind w:firstLine="709"/>
-        <w:jc w:val="both"/>
-      </w:pPr>
-      <w:r>
-        <w:rPr>
-          <w:rFonts w:ascii="Times New Roman" w:hAnsi="Times New Roman" w:eastAsia="Times New Roman"/>
-          <w:b w:val="0"/>
-          <w:i w:val="0"/>
-          <w:sz w:val="24"/>
-        </w:rPr>
-        <w:t>В программе применены типы int, float, str, bool и Decimal, преобразование пользовательского ввода, арифметические операции, условные конструкции и импорт из стандартного модуля decimal. Логика разделена на функции get_skin_condition, is_wear_allowed, calculate_balance_after_purchase и get_purchase_status.</w:t>
-      </w:r>
-    </w:p>
-    <w:p>
-      <w:pPr>
-        <w:keepNext/>
-        <w:spacing w:before="100" w:after="40"/>
-        <w:jc w:val="left"/>
-      </w:pPr>
-      <w:r>
-        <w:rPr>
-          <w:rFonts w:ascii="Times New Roman" w:hAnsi="Times New Roman" w:eastAsia="Times New Roman"/>
-          <w:b/>
-          <w:i w:val="0"/>
-          <w:sz w:val="24"/>
-        </w:rPr>
-        <w:t>4 Результат работы</w:t>
-      </w:r>
-    </w:p>
-    <w:p>
-      <w:pPr>
-        <w:spacing w:line="276" w:lineRule="auto" w:after="40"/>
-        <w:ind w:firstLine="709"/>
-        <w:jc w:val="both"/>
-      </w:pPr>
-      <w:r>
-        <w:rPr>
-          <w:rFonts w:ascii="Times New Roman" w:hAnsi="Times New Roman" w:eastAsia="Times New Roman"/>
-          <w:b w:val="0"/>
-          <w:i w:val="0"/>
-          <w:sz w:val="24"/>
-        </w:rPr>
-        <w:t>Создан Git-репозиторий с веткой main, подготовлены README.md и .gitignore, реализован начальный программный сценарий. Выполнены проверки корректного состояния скина, границ допустимого износа, достаточности баланса и недоступности предмета. Проект подготовлен к расширению коллекциями, JSON-файлами, тестами и объектной моделью.</w:t>
-      </w:r>
-    </w:p>
-    <w:p>
-      <w:pPr>
-        <w:keepNext/>
-        <w:spacing w:before="100" w:after="40"/>
-        <w:jc w:val="left"/>
-      </w:pPr>
-      <w:r>
-        <w:rPr>
-          <w:rFonts w:ascii="Times New Roman" w:hAnsi="Times New Roman" w:eastAsia="Times New Roman"/>
-          <w:b/>
-          <w:i w:val="0"/>
-          <w:sz w:val="24"/>
-        </w:rPr>
-        <w:t>5 Вывод</w:t>
-      </w:r>
-    </w:p>
-    <w:p>
-      <w:pPr>
-        <w:spacing w:line="276" w:lineRule="auto" w:after="40"/>
-        <w:ind w:firstLine="709"/>
-        <w:jc w:val="both"/>
-      </w:pPr>
-      <w:r>
-        <w:rPr>
-          <w:rFonts w:ascii="Times New Roman" w:hAnsi="Times New Roman" w:eastAsia="Times New Roman"/>
-          <w:b w:val="0"/>
-          <w:i w:val="0"/>
-          <w:sz w:val="24"/>
-        </w:rPr>
-        <w:t>В ходе работы закреплены базовые конструкции Python и начата разработка сквозного проекта. Полученная программа решает законченный учебный сценарий и создаёт основу для последующего перехода к модульной структуре, хранению данных и объектно-ориентированному программированию.</w:t>
+        <w:t>Закреплены базовые конструкции Python и создана основа сквозного проекта для дальнейшего перехода к модулям, хранению данных и ООП.</w:t>
       </w:r>
     </w:p>
     <w:p>
@@ -1776,7 +1723,7 @@
           <w:b w:val="0"/>
           <w:sz w:val="22"/>
         </w:rPr>
-        <w:t>Рисунок 1 — запуск программы ПР1</w:t>
+        <w:t>Рисунок 1 — запуск версии ПР1 из коммита d04100d</w:t>
       </w:r>
     </w:p>
     <w:p>
@@ -1786,7 +1733,7 @@
       <w:r>
         <w:drawing>
           <wp:inline xmlns:a="http://schemas.openxmlformats.org/drawingml/2006/main" xmlns:pic="http://schemas.openxmlformats.org/drawingml/2006/picture">
-            <wp:extent cx="5580000" cy="1365240"/>
+            <wp:extent cx="5760000" cy="1715928"/>
             <wp:docPr id="1468553569" name="Picture 1468553569"/>
             <wp:cNvGraphicFramePr>
               <a:graphicFrameLocks noChangeAspect="1"/>
@@ -1795,7 +1742,7 @@
               <a:graphicData uri="http://schemas.openxmlformats.org/drawingml/2006/picture">
                 <pic:pic>
                   <pic:nvPicPr>
-                    <pic:cNvPr id="0" name="pr1_run.png"/>
+                    <pic:cNvPr id="0" name="user_pr1_run.png"/>
                     <pic:cNvPicPr/>
                   </pic:nvPicPr>
                   <pic:blipFill>
@@ -1807,7 +1754,7 @@
                   <pic:spPr>
                     <a:xfrm>
                       <a:off x="0" y="0"/>
-                      <a:ext cx="5580000" cy="1365240"/>
+                      <a:ext cx="5760000" cy="1715928"/>
                     </a:xfrm>
                     <a:prstGeom prst="rect"/>
                   </pic:spPr>
@@ -1830,7 +1777,7 @@
           <w:b w:val="0"/>
           <w:sz w:val="22"/>
         </w:rPr>
-        <w:t>Рисунок 2 — история изменений Git</w:t>
+        <w:t>Рисунок 2 — пошаговая отладка и значения переменных</w:t>
       </w:r>
     </w:p>
     <w:p>
@@ -1840,7 +1787,7 @@
       <w:r>
         <w:drawing>
           <wp:inline xmlns:a="http://schemas.openxmlformats.org/drawingml/2006/main" xmlns:pic="http://schemas.openxmlformats.org/drawingml/2006/picture">
-            <wp:extent cx="5580000" cy="903960"/>
+            <wp:extent cx="5760000" cy="3323303"/>
             <wp:docPr id="1468553570" name="Picture 1468553570"/>
             <wp:cNvGraphicFramePr>
               <a:graphicFrameLocks noChangeAspect="1"/>
@@ -1849,7 +1796,7 @@
               <a:graphicData uri="http://schemas.openxmlformats.org/drawingml/2006/picture">
                 <pic:pic>
                   <pic:nvPicPr>
-                    <pic:cNvPr id="0" name="git_history.png"/>
+                    <pic:cNvPr id="0" name="user_pr1_debug.png"/>
                     <pic:cNvPicPr/>
                   </pic:nvPicPr>
                   <pic:blipFill>
@@ -1861,7 +1808,7 @@
                   <pic:spPr>
                     <a:xfrm>
                       <a:off x="0" y="0"/>
-                      <a:ext cx="5580000" cy="903960"/>
+                      <a:ext cx="5760000" cy="3323303"/>
                     </a:xfrm>
                     <a:prstGeom prst="rect"/>
                   </pic:spPr>

</xml_diff>

<commit_message>
Add student evidence to practical reports
</commit_message>
<xml_diff>
--- a/Отчет_ПР1_Есина_В.Д.docx
+++ b/Отчет_ПР1_Есина_В.Д.docx
@@ -1635,6 +1635,79 @@
           <w:sz w:val="24"/>
         </w:rPr>
         <w:t>Закреплены основные конструкции Python и создана основа сквозного проекта, пригодная для дальнейшего перехода к коллекциям, JSON и объектной модели.</w:t>
+      </w:r>
+    </w:p>
+    <w:p>
+      <w:r>
+        <w:br w:type="page"/>
+      </w:r>
+    </w:p>
+    <w:p>
+      <w:pPr>
+        <w:spacing w:after="160"/>
+        <w:jc w:val="center"/>
+      </w:pPr>
+      <w:r>
+        <w:rPr>
+          <w:rFonts w:ascii="Times New Roman" w:hAnsi="Times New Roman"/>
+          <w:b/>
+          <w:sz w:val="30"/>
+        </w:rPr>
+        <w:t>ПРИЛОЖЕНИЕ. ПОДТВЕРЖДЕНИЕ ВЫПОЛНЕНИЯ</w:t>
+      </w:r>
+    </w:p>
+    <w:p>
+      <w:pPr>
+        <w:spacing w:before="0" w:after="80"/>
+        <w:jc w:val="center"/>
+      </w:pPr>
+      <w:r>
+        <w:rPr>
+          <w:rFonts w:ascii="Times New Roman" w:hAnsi="Times New Roman"/>
+          <w:b w:val="0"/>
+          <w:sz w:val="22"/>
+        </w:rPr>
+        <w:t>Рисунок 1 — запуск базового сценария ПР1</w:t>
+      </w:r>
+    </w:p>
+    <w:p>
+      <w:pPr>
+        <w:spacing w:after="120"/>
+        <w:jc w:val="center"/>
+      </w:pPr>
+      <w:r>
+        <w:drawing>
+          <wp:inline xmlns:a="http://schemas.openxmlformats.org/drawingml/2006/main" xmlns:pic="http://schemas.openxmlformats.org/drawingml/2006/picture">
+            <wp:extent cx="5715000" cy="2303495"/>
+            <wp:docPr id="1468553569" name="Picture 1468553569"/>
+            <wp:cNvGraphicFramePr>
+              <a:graphicFrameLocks noChangeAspect="1"/>
+            </wp:cNvGraphicFramePr>
+            <a:graphic>
+              <a:graphicData uri="http://schemas.openxmlformats.org/drawingml/2006/picture">
+                <pic:pic>
+                  <pic:nvPicPr>
+                    <pic:cNvPr id="0" name="pr1_run_rooms.png"/>
+                    <pic:cNvPicPr/>
+                  </pic:nvPicPr>
+                  <pic:blipFill>
+                    <a:blip r:embed="rId9"/>
+                    <a:stretch>
+                      <a:fillRect/>
+                    </a:stretch>
+                  </pic:blipFill>
+                  <pic:spPr>
+                    <a:xfrm>
+                      <a:off x="0" y="0"/>
+                      <a:ext cx="5715000" cy="2303495"/>
+                    </a:xfrm>
+                    <a:prstGeom prst="rect"/>
+                  </pic:spPr>
+                </pic:pic>
+              </a:graphicData>
+            </a:graphic>
+          </wp:inline>
+        </w:drawing>
       </w:r>
     </w:p>
     <w:sectPr>

</xml_diff>

<commit_message>
Add debugging evidence to practical work 1 report
</commit_message>
<xml_diff>
--- a/Отчет_ПР1_Есина_В.Д.docx
+++ b/Отчет_ПР1_Есина_В.Д.docx
@@ -1700,6 +1700,58 @@
                     <a:xfrm>
                       <a:off x="0" y="0"/>
                       <a:ext cx="5715000" cy="2303495"/>
+                    </a:xfrm>
+                    <a:prstGeom prst="rect"/>
+                  </pic:spPr>
+                </pic:pic>
+              </a:graphicData>
+            </a:graphic>
+          </wp:inline>
+        </w:drawing>
+      </w:r>
+    </w:p>
+    <w:p>
+      <w:pPr>
+        <w:spacing w:before="120" w:after="80"/>
+        <w:jc w:val="center"/>
+      </w:pPr>
+      <w:r>
+        <w:rPr>
+          <w:rFonts w:ascii="Times New Roman" w:hAnsi="Times New Roman"/>
+          <w:sz w:val="22"/>
+        </w:rPr>
+        <w:t>Рисунок 2 — точка останова и значения переменных при отладке</w:t>
+      </w:r>
+    </w:p>
+    <w:p>
+      <w:pPr>
+        <w:jc w:val="center"/>
+      </w:pPr>
+      <w:r>
+        <w:drawing>
+          <wp:inline xmlns:a="http://schemas.openxmlformats.org/drawingml/2006/main" xmlns:pic="http://schemas.openxmlformats.org/drawingml/2006/picture">
+            <wp:extent cx="5715000" cy="3534011"/>
+            <wp:docPr id="1468553570" name="Picture 1468553570"/>
+            <wp:cNvGraphicFramePr>
+              <a:graphicFrameLocks noChangeAspect="1"/>
+            </wp:cNvGraphicFramePr>
+            <a:graphic>
+              <a:graphicData uri="http://schemas.openxmlformats.org/drawingml/2006/picture">
+                <pic:pic>
+                  <pic:nvPicPr>
+                    <pic:cNvPr id="0" name="pr1_debug_rooms.png"/>
+                    <pic:cNvPicPr/>
+                  </pic:nvPicPr>
+                  <pic:blipFill>
+                    <a:blip r:embed="rId10"/>
+                    <a:stretch>
+                      <a:fillRect/>
+                    </a:stretch>
+                  </pic:blipFill>
+                  <pic:spPr>
+                    <a:xfrm>
+                      <a:off x="0" y="0"/>
+                      <a:ext cx="5715000" cy="3534011"/>
                     </a:xfrm>
                     <a:prstGeom prst="rect"/>
                   </pic:spPr>

</xml_diff>